<commit_message>
Add Arabic strategy document with adaptive threshold section
</commit_message>
<xml_diff>
--- a/استراتيجية_البوت.docx
+++ b/استراتيجية_البوت.docx
@@ -2980,6 +2980,799 @@
         <w:t>ATR = متوسط المدى الحقيقي — مقياس موضوعي لتذبذب السوق. الناسداك يسمح بوقف خسارة أوسع لأنه الأعنف تذبذباً.</w:t>
       </w:r>
     </w:p>
+    <w:p>
+      <w:pPr>
+        <w:pStyle w:val="Heading1"/>
+        <w:jc w:val="right"/>
+        <w:bidi/>
+      </w:pPr>
+      <w:r>
+        <w:rPr>
+          <w:color w:val="1F3864"/>
+        </w:rPr>
+        <w:t>سابعاً: العتبة التكيفية (Adaptive Threshold)</w:t>
+      </w:r>
+    </w:p>
+    <w:p>
+      <w:pPr>
+        <w:jc w:val="right"/>
+        <w:bidi/>
+      </w:pPr>
+      <w:r>
+        <w:rPr>
+          <w:rFonts w:ascii="Arial" w:hAnsi="Arial"/>
+          <w:b/>
+          <w:sz w:val="22"/>
+        </w:rPr>
+        <w:t>المشكلة التي تحلها</w:t>
+      </w:r>
+    </w:p>
+    <w:p>
+      <w:pPr>
+        <w:jc w:val="right"/>
+        <w:bidi/>
+      </w:pPr>
+      <w:r>
+        <w:rPr>
+          <w:rFonts w:ascii="Arial" w:hAnsi="Arial"/>
+          <w:b w:val="0"/>
+          <w:sz w:val="22"/>
+        </w:rPr>
+        <w:t>البوت عنده عتبة أساسية 75 نقطة للإشارة A+. في بعض الأيام السوق هادئ جداً ولا توجد إشارات تتجاوز 75 — النتيجة يوم بدون تنبيهات رغم وجود فرص معقولة. العتبة التكيفية تحل هذه المشكلة.</w:t>
+      </w:r>
+    </w:p>
+    <w:p/>
+    <w:p>
+      <w:pPr>
+        <w:jc w:val="right"/>
+        <w:bidi/>
+      </w:pPr>
+      <w:r>
+        <w:rPr>
+          <w:rFonts w:ascii="Arial" w:hAnsi="Arial"/>
+          <w:b/>
+          <w:sz w:val="22"/>
+        </w:rPr>
+        <w:t>كيف تعمل؟</w:t>
+      </w:r>
+    </w:p>
+    <w:tbl>
+      <w:tblPr>
+        <w:tblStyle w:val="TableGrid"/>
+        <w:tblW w:type="auto" w:w="0"/>
+        <w:tblLook w:firstColumn="1" w:firstRow="1" w:lastColumn="0" w:lastRow="0" w:noHBand="0" w:noVBand="1" w:val="04A0"/>
+      </w:tblPr>
+      <w:tblGrid>
+        <w:gridCol w:w="2928"/>
+        <w:gridCol w:w="2928"/>
+        <w:gridCol w:w="2928"/>
+      </w:tblGrid>
+      <w:tr>
+        <w:tc>
+          <w:tcPr>
+            <w:tcW w:type="dxa" w:w="2928"/>
+            <w:shd w:val="clear" w:color="auto" w:fill="1F3864"/>
+          </w:tcPr>
+          <w:p>
+            <w:pPr>
+              <w:jc w:val="center"/>
+            </w:pPr>
+            <w:r>
+              <w:rPr>
+                <w:rFonts w:ascii="Arial" w:hAnsi="Arial"/>
+                <w:b/>
+                <w:color w:val="FFFFFF"/>
+                <w:sz w:val="20"/>
+              </w:rPr>
+              <w:t>السيناريو</w:t>
+            </w:r>
+          </w:p>
+        </w:tc>
+        <w:tc>
+          <w:tcPr>
+            <w:tcW w:type="dxa" w:w="2928"/>
+            <w:shd w:val="clear" w:color="auto" w:fill="1F3864"/>
+          </w:tcPr>
+          <w:p>
+            <w:pPr>
+              <w:jc w:val="center"/>
+            </w:pPr>
+            <w:r>
+              <w:rPr>
+                <w:rFonts w:ascii="Arial" w:hAnsi="Arial"/>
+                <w:b/>
+                <w:color w:val="FFFFFF"/>
+                <w:sz w:val="20"/>
+              </w:rPr>
+              <w:t>الشرط</w:t>
+            </w:r>
+          </w:p>
+        </w:tc>
+        <w:tc>
+          <w:tcPr>
+            <w:tcW w:type="dxa" w:w="2928"/>
+            <w:shd w:val="clear" w:color="auto" w:fill="1F3864"/>
+          </w:tcPr>
+          <w:p>
+            <w:pPr>
+              <w:jc w:val="center"/>
+            </w:pPr>
+            <w:r>
+              <w:rPr>
+                <w:rFonts w:ascii="Arial" w:hAnsi="Arial"/>
+                <w:b/>
+                <w:color w:val="FFFFFF"/>
+                <w:sz w:val="20"/>
+              </w:rPr>
+              <w:t>التعديل</w:t>
+            </w:r>
+          </w:p>
+        </w:tc>
+      </w:tr>
+      <w:tr>
+        <w:tc>
+          <w:tcPr>
+            <w:tcW w:type="dxa" w:w="2928"/>
+          </w:tcPr>
+          <w:p>
+            <w:pPr>
+              <w:jc w:val="center"/>
+            </w:pPr>
+            <w:r>
+              <w:rPr>
+                <w:rFonts w:ascii="Arial" w:hAnsi="Arial"/>
+                <w:sz w:val="20"/>
+              </w:rPr>
+              <w:t>سوق هادئ</w:t>
+            </w:r>
+          </w:p>
+        </w:tc>
+        <w:tc>
+          <w:tcPr>
+            <w:tcW w:type="dxa" w:w="2928"/>
+          </w:tcPr>
+          <w:p>
+            <w:pPr>
+              <w:jc w:val="center"/>
+            </w:pPr>
+            <w:r>
+              <w:rPr>
+                <w:rFonts w:ascii="Arial" w:hAnsi="Arial"/>
+                <w:sz w:val="20"/>
+              </w:rPr>
+              <w:t>3 أيام متتالية بلا إشارات A+</w:t>
+            </w:r>
+          </w:p>
+        </w:tc>
+        <w:tc>
+          <w:tcPr>
+            <w:tcW w:type="dxa" w:w="2928"/>
+          </w:tcPr>
+          <w:p>
+            <w:pPr>
+              <w:jc w:val="center"/>
+            </w:pPr>
+            <w:r>
+              <w:rPr>
+                <w:rFonts w:ascii="Arial" w:hAnsi="Arial"/>
+                <w:sz w:val="20"/>
+              </w:rPr>
+              <w:t>العتبة تنزل 2 نقطة (من 75 إلى 73...)</w:t>
+            </w:r>
+          </w:p>
+        </w:tc>
+      </w:tr>
+      <w:tr>
+        <w:tc>
+          <w:tcPr>
+            <w:tcW w:type="dxa" w:w="2928"/>
+          </w:tcPr>
+          <w:p>
+            <w:pPr>
+              <w:jc w:val="center"/>
+            </w:pPr>
+            <w:r>
+              <w:rPr>
+                <w:rFonts w:ascii="Arial" w:hAnsi="Arial"/>
+                <w:sz w:val="20"/>
+              </w:rPr>
+              <w:t>سوق نشط</w:t>
+            </w:r>
+          </w:p>
+        </w:tc>
+        <w:tc>
+          <w:tcPr>
+            <w:tcW w:type="dxa" w:w="2928"/>
+          </w:tcPr>
+          <w:p>
+            <w:pPr>
+              <w:jc w:val="center"/>
+            </w:pPr>
+            <w:r>
+              <w:rPr>
+                <w:rFonts w:ascii="Arial" w:hAnsi="Arial"/>
+                <w:sz w:val="20"/>
+              </w:rPr>
+              <w:t>A+ في اليوم وصلت للحد الأقصى (4)</w:t>
+            </w:r>
+          </w:p>
+        </w:tc>
+        <w:tc>
+          <w:tcPr>
+            <w:tcW w:type="dxa" w:w="2928"/>
+          </w:tcPr>
+          <w:p>
+            <w:pPr>
+              <w:jc w:val="center"/>
+            </w:pPr>
+            <w:r>
+              <w:rPr>
+                <w:rFonts w:ascii="Arial" w:hAnsi="Arial"/>
+                <w:sz w:val="20"/>
+              </w:rPr>
+              <w:t>العتبة ترتفع نقطة واحدة</w:t>
+            </w:r>
+          </w:p>
+        </w:tc>
+      </w:tr>
+      <w:tr>
+        <w:tc>
+          <w:tcPr>
+            <w:tcW w:type="dxa" w:w="2928"/>
+          </w:tcPr>
+          <w:p>
+            <w:pPr>
+              <w:jc w:val="center"/>
+            </w:pPr>
+            <w:r>
+              <w:rPr>
+                <w:rFonts w:ascii="Arial" w:hAnsi="Arial"/>
+                <w:sz w:val="20"/>
+              </w:rPr>
+              <w:t>خسائر متكررة</w:t>
+            </w:r>
+          </w:p>
+        </w:tc>
+        <w:tc>
+          <w:tcPr>
+            <w:tcW w:type="dxa" w:w="2928"/>
+          </w:tcPr>
+          <w:p>
+            <w:pPr>
+              <w:jc w:val="center"/>
+            </w:pPr>
+            <w:r>
+              <w:rPr>
+                <w:rFonts w:ascii="Arial" w:hAnsi="Arial"/>
+                <w:sz w:val="20"/>
+              </w:rPr>
+              <w:t>3 خسائر متتالية</w:t>
+            </w:r>
+          </w:p>
+        </w:tc>
+        <w:tc>
+          <w:tcPr>
+            <w:tcW w:type="dxa" w:w="2928"/>
+          </w:tcPr>
+          <w:p>
+            <w:pPr>
+              <w:jc w:val="center"/>
+            </w:pPr>
+            <w:r>
+              <w:rPr>
+                <w:rFonts w:ascii="Arial" w:hAnsi="Arial"/>
+                <w:sz w:val="20"/>
+              </w:rPr>
+              <w:t>العتبة ترتفع 5 نقاط إضافية</w:t>
+            </w:r>
+          </w:p>
+        </w:tc>
+      </w:tr>
+      <w:tr>
+        <w:tc>
+          <w:tcPr>
+            <w:tcW w:type="dxa" w:w="2928"/>
+          </w:tcPr>
+          <w:p>
+            <w:pPr>
+              <w:jc w:val="center"/>
+            </w:pPr>
+            <w:r>
+              <w:rPr>
+                <w:rFonts w:ascii="Arial" w:hAnsi="Arial"/>
+                <w:sz w:val="20"/>
+              </w:rPr>
+              <w:t>الحد الأدنى</w:t>
+            </w:r>
+          </w:p>
+        </w:tc>
+        <w:tc>
+          <w:tcPr>
+            <w:tcW w:type="dxa" w:w="2928"/>
+          </w:tcPr>
+          <w:p>
+            <w:pPr>
+              <w:jc w:val="center"/>
+            </w:pPr>
+            <w:r>
+              <w:rPr>
+                <w:rFonts w:ascii="Arial" w:hAnsi="Arial"/>
+                <w:sz w:val="20"/>
+              </w:rPr>
+              <w:t>مهما كان السوق هادئاً</w:t>
+            </w:r>
+          </w:p>
+        </w:tc>
+        <w:tc>
+          <w:tcPr>
+            <w:tcW w:type="dxa" w:w="2928"/>
+          </w:tcPr>
+          <w:p>
+            <w:pPr>
+              <w:jc w:val="center"/>
+            </w:pPr>
+            <w:r>
+              <w:rPr>
+                <w:rFonts w:ascii="Arial" w:hAnsi="Arial"/>
+                <w:sz w:val="20"/>
+              </w:rPr>
+              <w:t>لا تنزل أقل من 65</w:t>
+            </w:r>
+          </w:p>
+        </w:tc>
+      </w:tr>
+      <w:tr>
+        <w:tc>
+          <w:tcPr>
+            <w:tcW w:type="dxa" w:w="2928"/>
+          </w:tcPr>
+          <w:p>
+            <w:pPr>
+              <w:jc w:val="center"/>
+            </w:pPr>
+            <w:r>
+              <w:rPr>
+                <w:rFonts w:ascii="Arial" w:hAnsi="Arial"/>
+                <w:sz w:val="20"/>
+              </w:rPr>
+              <w:t>الحد الأقصى</w:t>
+            </w:r>
+          </w:p>
+        </w:tc>
+        <w:tc>
+          <w:tcPr>
+            <w:tcW w:type="dxa" w:w="2928"/>
+          </w:tcPr>
+          <w:p>
+            <w:pPr>
+              <w:jc w:val="center"/>
+            </w:pPr>
+            <w:r>
+              <w:rPr>
+                <w:rFonts w:ascii="Arial" w:hAnsi="Arial"/>
+                <w:sz w:val="20"/>
+              </w:rPr>
+              <w:t>مهما كان السوق نشطاً</w:t>
+            </w:r>
+          </w:p>
+        </w:tc>
+        <w:tc>
+          <w:tcPr>
+            <w:tcW w:type="dxa" w:w="2928"/>
+          </w:tcPr>
+          <w:p>
+            <w:pPr>
+              <w:jc w:val="center"/>
+            </w:pPr>
+            <w:r>
+              <w:rPr>
+                <w:rFonts w:ascii="Arial" w:hAnsi="Arial"/>
+                <w:sz w:val="20"/>
+              </w:rPr>
+              <w:t>لا ترتفع فوق 85</w:t>
+            </w:r>
+          </w:p>
+        </w:tc>
+      </w:tr>
+    </w:tbl>
+    <w:p/>
+    <w:p>
+      <w:pPr>
+        <w:jc w:val="right"/>
+        <w:bidi/>
+      </w:pPr>
+      <w:r>
+        <w:rPr>
+          <w:rFonts w:ascii="Arial" w:hAnsi="Arial"/>
+          <w:b/>
+          <w:sz w:val="22"/>
+        </w:rPr>
+        <w:t>تشبيه عملي</w:t>
+      </w:r>
+    </w:p>
+    <w:p>
+      <w:pPr>
+        <w:jc w:val="right"/>
+        <w:bidi/>
+      </w:pPr>
+      <w:r>
+        <w:rPr>
+          <w:rFonts w:ascii="Arial" w:hAnsi="Arial"/>
+          <w:b w:val="0"/>
+          <w:sz w:val="22"/>
+        </w:rPr>
+        <w:t>تخيل مصفاة ماء: في الأيام العادية فتحتها متوسطة. لو المياه قليلة (سوق هادئ) تفتحها أكثر. لو المياه كثيرة (سوق متقلب أو كثير الإشارات) تضيّقها. الهدف الثابت دائماً: تنبيهات بجودة معقولة كل يوم — لا صمت تام ولا فوضى.</w:t>
+      </w:r>
+    </w:p>
+    <w:p/>
+    <w:p>
+      <w:pPr>
+        <w:jc w:val="right"/>
+        <w:bidi/>
+      </w:pPr>
+      <w:r>
+        <w:rPr>
+          <w:rFonts w:ascii="Arial" w:hAnsi="Arial"/>
+          <w:b/>
+          <w:sz w:val="22"/>
+        </w:rPr>
+        <w:t>مثال تطبيقي</w:t>
+      </w:r>
+    </w:p>
+    <w:tbl>
+      <w:tblPr>
+        <w:tblStyle w:val="TableGrid"/>
+        <w:tblW w:type="auto" w:w="0"/>
+        <w:tblLook w:firstColumn="1" w:firstRow="1" w:lastColumn="0" w:lastRow="0" w:noHBand="0" w:noVBand="1" w:val="04A0"/>
+      </w:tblPr>
+      <w:tblGrid>
+        <w:gridCol w:w="2928"/>
+        <w:gridCol w:w="2928"/>
+        <w:gridCol w:w="2928"/>
+      </w:tblGrid>
+      <w:tr>
+        <w:tc>
+          <w:tcPr>
+            <w:tcW w:type="dxa" w:w="2928"/>
+            <w:shd w:val="clear" w:color="auto" w:fill="1F3864"/>
+          </w:tcPr>
+          <w:p>
+            <w:pPr>
+              <w:jc w:val="center"/>
+            </w:pPr>
+            <w:r>
+              <w:rPr>
+                <w:rFonts w:ascii="Arial" w:hAnsi="Arial"/>
+                <w:b/>
+                <w:color w:val="FFFFFF"/>
+                <w:sz w:val="20"/>
+              </w:rPr>
+              <w:t>اليوم</w:t>
+            </w:r>
+          </w:p>
+        </w:tc>
+        <w:tc>
+          <w:tcPr>
+            <w:tcW w:type="dxa" w:w="2928"/>
+            <w:shd w:val="clear" w:color="auto" w:fill="1F3864"/>
+          </w:tcPr>
+          <w:p>
+            <w:pPr>
+              <w:jc w:val="center"/>
+            </w:pPr>
+            <w:r>
+              <w:rPr>
+                <w:rFonts w:ascii="Arial" w:hAnsi="Arial"/>
+                <w:b/>
+                <w:color w:val="FFFFFF"/>
+                <w:sz w:val="20"/>
+              </w:rPr>
+              <w:t>الحالة</w:t>
+            </w:r>
+          </w:p>
+        </w:tc>
+        <w:tc>
+          <w:tcPr>
+            <w:tcW w:type="dxa" w:w="2928"/>
+            <w:shd w:val="clear" w:color="auto" w:fill="1F3864"/>
+          </w:tcPr>
+          <w:p>
+            <w:pPr>
+              <w:jc w:val="center"/>
+            </w:pPr>
+            <w:r>
+              <w:rPr>
+                <w:rFonts w:ascii="Arial" w:hAnsi="Arial"/>
+                <w:b/>
+                <w:color w:val="FFFFFF"/>
+                <w:sz w:val="20"/>
+              </w:rPr>
+              <w:t>العتبة</w:t>
+            </w:r>
+          </w:p>
+        </w:tc>
+      </w:tr>
+      <w:tr>
+        <w:tc>
+          <w:tcPr>
+            <w:tcW w:type="dxa" w:w="2928"/>
+          </w:tcPr>
+          <w:p>
+            <w:pPr>
+              <w:jc w:val="center"/>
+            </w:pPr>
+            <w:r>
+              <w:rPr>
+                <w:rFonts w:ascii="Arial" w:hAnsi="Arial"/>
+                <w:sz w:val="20"/>
+              </w:rPr>
+              <w:t>الاثنين</w:t>
+            </w:r>
+          </w:p>
+        </w:tc>
+        <w:tc>
+          <w:tcPr>
+            <w:tcW w:type="dxa" w:w="2928"/>
+          </w:tcPr>
+          <w:p>
+            <w:pPr>
+              <w:jc w:val="center"/>
+            </w:pPr>
+            <w:r>
+              <w:rPr>
+                <w:rFonts w:ascii="Arial" w:hAnsi="Arial"/>
+                <w:sz w:val="20"/>
+              </w:rPr>
+              <w:t>لا إشارات (يوم 1 صامت)</w:t>
+            </w:r>
+          </w:p>
+        </w:tc>
+        <w:tc>
+          <w:tcPr>
+            <w:tcW w:type="dxa" w:w="2928"/>
+          </w:tcPr>
+          <w:p>
+            <w:pPr>
+              <w:jc w:val="center"/>
+            </w:pPr>
+            <w:r>
+              <w:rPr>
+                <w:rFonts w:ascii="Arial" w:hAnsi="Arial"/>
+                <w:sz w:val="20"/>
+              </w:rPr>
+              <w:t>75 (لم تتغير بعد)</w:t>
+            </w:r>
+          </w:p>
+        </w:tc>
+      </w:tr>
+      <w:tr>
+        <w:tc>
+          <w:tcPr>
+            <w:tcW w:type="dxa" w:w="2928"/>
+          </w:tcPr>
+          <w:p>
+            <w:pPr>
+              <w:jc w:val="center"/>
+            </w:pPr>
+            <w:r>
+              <w:rPr>
+                <w:rFonts w:ascii="Arial" w:hAnsi="Arial"/>
+                <w:sz w:val="20"/>
+              </w:rPr>
+              <w:t>الثلاثاء</w:t>
+            </w:r>
+          </w:p>
+        </w:tc>
+        <w:tc>
+          <w:tcPr>
+            <w:tcW w:type="dxa" w:w="2928"/>
+          </w:tcPr>
+          <w:p>
+            <w:pPr>
+              <w:jc w:val="center"/>
+            </w:pPr>
+            <w:r>
+              <w:rPr>
+                <w:rFonts w:ascii="Arial" w:hAnsi="Arial"/>
+                <w:sz w:val="20"/>
+              </w:rPr>
+              <w:t>لا إشارات (يوم 2 صامت)</w:t>
+            </w:r>
+          </w:p>
+        </w:tc>
+        <w:tc>
+          <w:tcPr>
+            <w:tcW w:type="dxa" w:w="2928"/>
+          </w:tcPr>
+          <w:p>
+            <w:pPr>
+              <w:jc w:val="center"/>
+            </w:pPr>
+            <w:r>
+              <w:rPr>
+                <w:rFonts w:ascii="Arial" w:hAnsi="Arial"/>
+                <w:sz w:val="20"/>
+              </w:rPr>
+              <w:t>75 (لم تتغير بعد)</w:t>
+            </w:r>
+          </w:p>
+        </w:tc>
+      </w:tr>
+      <w:tr>
+        <w:tc>
+          <w:tcPr>
+            <w:tcW w:type="dxa" w:w="2928"/>
+          </w:tcPr>
+          <w:p>
+            <w:pPr>
+              <w:jc w:val="center"/>
+            </w:pPr>
+            <w:r>
+              <w:rPr>
+                <w:rFonts w:ascii="Arial" w:hAnsi="Arial"/>
+                <w:sz w:val="20"/>
+              </w:rPr>
+              <w:t>الأربعاء</w:t>
+            </w:r>
+          </w:p>
+        </w:tc>
+        <w:tc>
+          <w:tcPr>
+            <w:tcW w:type="dxa" w:w="2928"/>
+          </w:tcPr>
+          <w:p>
+            <w:pPr>
+              <w:jc w:val="center"/>
+            </w:pPr>
+            <w:r>
+              <w:rPr>
+                <w:rFonts w:ascii="Arial" w:hAnsi="Arial"/>
+                <w:sz w:val="20"/>
+              </w:rPr>
+              <w:t>لا إشارات (يوم 3 صامت)</w:t>
+            </w:r>
+          </w:p>
+        </w:tc>
+        <w:tc>
+          <w:tcPr>
+            <w:tcW w:type="dxa" w:w="2928"/>
+          </w:tcPr>
+          <w:p>
+            <w:pPr>
+              <w:jc w:val="center"/>
+            </w:pPr>
+            <w:r>
+              <w:rPr>
+                <w:rFonts w:ascii="Arial" w:hAnsi="Arial"/>
+                <w:sz w:val="20"/>
+              </w:rPr>
+              <w:t>تنزل إلى 73 ✅</w:t>
+            </w:r>
+          </w:p>
+        </w:tc>
+      </w:tr>
+      <w:tr>
+        <w:tc>
+          <w:tcPr>
+            <w:tcW w:type="dxa" w:w="2928"/>
+          </w:tcPr>
+          <w:p>
+            <w:pPr>
+              <w:jc w:val="center"/>
+            </w:pPr>
+            <w:r>
+              <w:rPr>
+                <w:rFonts w:ascii="Arial" w:hAnsi="Arial"/>
+                <w:sz w:val="20"/>
+              </w:rPr>
+              <w:t>الخميس</w:t>
+            </w:r>
+          </w:p>
+        </w:tc>
+        <w:tc>
+          <w:tcPr>
+            <w:tcW w:type="dxa" w:w="2928"/>
+          </w:tcPr>
+          <w:p>
+            <w:pPr>
+              <w:jc w:val="center"/>
+            </w:pPr>
+            <w:r>
+              <w:rPr>
+                <w:rFonts w:ascii="Arial" w:hAnsi="Arial"/>
+                <w:sz w:val="20"/>
+              </w:rPr>
+              <w:t>إشارة A+ أُرسلت</w:t>
+            </w:r>
+          </w:p>
+        </w:tc>
+        <w:tc>
+          <w:tcPr>
+            <w:tcW w:type="dxa" w:w="2928"/>
+          </w:tcPr>
+          <w:p>
+            <w:pPr>
+              <w:jc w:val="center"/>
+            </w:pPr>
+            <w:r>
+              <w:rPr>
+                <w:rFonts w:ascii="Arial" w:hAnsi="Arial"/>
+                <w:sz w:val="20"/>
+              </w:rPr>
+              <w:t>73 (ترجع للعد من جديد)</w:t>
+            </w:r>
+          </w:p>
+        </w:tc>
+      </w:tr>
+      <w:tr>
+        <w:tc>
+          <w:tcPr>
+            <w:tcW w:type="dxa" w:w="2928"/>
+          </w:tcPr>
+          <w:p>
+            <w:pPr>
+              <w:jc w:val="center"/>
+            </w:pPr>
+            <w:r>
+              <w:rPr>
+                <w:rFonts w:ascii="Arial" w:hAnsi="Arial"/>
+                <w:sz w:val="20"/>
+              </w:rPr>
+              <w:t>الجمعة</w:t>
+            </w:r>
+          </w:p>
+        </w:tc>
+        <w:tc>
+          <w:tcPr>
+            <w:tcW w:type="dxa" w:w="2928"/>
+          </w:tcPr>
+          <w:p>
+            <w:pPr>
+              <w:jc w:val="center"/>
+            </w:pPr>
+            <w:r>
+              <w:rPr>
+                <w:rFonts w:ascii="Arial" w:hAnsi="Arial"/>
+                <w:sz w:val="20"/>
+              </w:rPr>
+              <w:t>4 إشارات A+ في اليوم</w:t>
+            </w:r>
+          </w:p>
+        </w:tc>
+        <w:tc>
+          <w:tcPr>
+            <w:tcW w:type="dxa" w:w="2928"/>
+          </w:tcPr>
+          <w:p>
+            <w:pPr>
+              <w:jc w:val="center"/>
+            </w:pPr>
+            <w:r>
+              <w:rPr>
+                <w:rFonts w:ascii="Arial" w:hAnsi="Arial"/>
+                <w:sz w:val="20"/>
+              </w:rPr>
+              <w:t>ترتفع إلى 74</w:t>
+            </w:r>
+          </w:p>
+        </w:tc>
+      </w:tr>
+    </w:tbl>
+    <w:p/>
+    <w:p>
+      <w:pPr>
+        <w:jc w:val="right"/>
+        <w:bidi/>
+      </w:pPr>
+      <w:r>
+        <w:rPr>
+          <w:rFonts w:ascii="Arial" w:hAnsi="Arial"/>
+          <w:b w:val="0"/>
+          <w:sz w:val="20"/>
+        </w:rPr>
+        <w:t>💡 ملاحظة: العتبة التكيفية تؤثر على إشارات A+ فقط. إشارات WATCH (62 نقطة فأكثر) ليس لها حد يومي وتُرسل متى توافرت الشروط.</w:t>
+      </w:r>
+    </w:p>
     <w:sectPr>
       <w:pgSz w:w="12240" w:h="15840"/>
       <w:pgMar w:top="1440" w:right="1728" w:bottom="1440" w:left="1728" w:header="720" w:footer="720" w:gutter="0"/>

</xml_diff>

<commit_message>
Add English adaptive threshold documentation to sweep_alert_agent.py
</commit_message>
<xml_diff>
--- a/استراتيجية_البوت.docx
+++ b/استراتيجية_البوت.docx
@@ -3773,6 +3773,538 @@
         <w:t>💡 ملاحظة: العتبة التكيفية تؤثر على إشارات A+ فقط. إشارات WATCH (62 نقطة فأكثر) ليس لها حد يومي وتُرسل متى توافرت الشروط.</w:t>
       </w:r>
     </w:p>
+    <w:p>
+      <w:r>
+        <w:br w:type="page"/>
+      </w:r>
+    </w:p>
+    <w:p>
+      <w:pPr>
+        <w:jc w:val="center"/>
+      </w:pPr>
+      <w:r>
+        <w:rPr>
+          <w:rFonts w:ascii="Arial" w:hAnsi="Arial"/>
+          <w:b/>
+          <w:color w:val="1F3864"/>
+          <w:sz w:val="36"/>
+        </w:rPr>
+        <w:t>Adaptive Threshold — Plain English</w:t>
+      </w:r>
+    </w:p>
+    <w:p/>
+    <w:p>
+      <w:pPr>
+        <w:pStyle w:val="Heading2"/>
+        <w:jc w:val="left"/>
+      </w:pPr>
+      <w:r>
+        <w:rPr>
+          <w:color w:val="1F3864"/>
+        </w:rPr>
+        <w:t>The Problem It Solves</w:t>
+      </w:r>
+    </w:p>
+    <w:p>
+      <w:pPr>
+        <w:jc w:val="left"/>
+      </w:pPr>
+      <w:r>
+        <w:rPr>
+          <w:rFonts w:ascii="Arial" w:hAnsi="Arial"/>
+          <w:b/>
+          <w:i w:val="0"/>
+          <w:sz w:val="22"/>
+        </w:rPr>
+        <w:t>The bot has a fixed threshold: 75 points to fire an A+ alert.</w:t>
+      </w:r>
+    </w:p>
+    <w:p>
+      <w:pPr>
+        <w:jc w:val="left"/>
+      </w:pPr>
+      <w:r>
+        <w:rPr>
+          <w:rFonts w:ascii="Arial" w:hAnsi="Arial"/>
+          <w:b w:val="0"/>
+          <w:i w:val="0"/>
+          <w:sz w:val="22"/>
+        </w:rPr>
+        <w:t>On quiet market days, nothing clears 75. Result? Zero alerts — even if decent setups exist just below the cutoff.</w:t>
+      </w:r>
+    </w:p>
+    <w:p/>
+    <w:p>
+      <w:pPr>
+        <w:pStyle w:val="Heading2"/>
+        <w:jc w:val="left"/>
+      </w:pPr>
+      <w:r>
+        <w:rPr>
+          <w:color w:val="1F3864"/>
+        </w:rPr>
+        <w:t>The Solution: Threshold Adjusts Automatically</w:t>
+      </w:r>
+    </w:p>
+    <w:p>
+      <w:pPr>
+        <w:jc w:val="left"/>
+      </w:pPr>
+      <w:r>
+        <w:rPr>
+          <w:rFonts w:ascii="Arial" w:hAnsi="Arial"/>
+          <w:b/>
+          <w:i w:val="0"/>
+          <w:sz w:val="22"/>
+        </w:rPr>
+        <w:t>Scenario 1 — Quiet days with no signals:</w:t>
+      </w:r>
+    </w:p>
+    <w:p>
+      <w:pPr>
+        <w:jc w:val="left"/>
+        <w:shd w:val="clear" w:color="auto" w:fill="F0F0F0"/>
+      </w:pPr>
+      <w:r>
+        <w:rPr>
+          <w:rFonts w:ascii="Courier New" w:hAnsi="Courier New"/>
+          <w:color w:val="1E1E1E"/>
+          <w:sz w:val="18"/>
+        </w:rPr>
+        <w:t>Day 1 with no alerts → threshold drops: 75 → 73</w:t>
+        <w:br/>
+        <w:t>Day 2 with no alerts → drops again:    73 → 71</w:t>
+        <w:br/>
+        <w:t>Day 3 with no alerts → drops again:    71 → 69</w:t>
+        <w:br/>
+        <w:t>Floor is 65 — never goes lower</w:t>
+      </w:r>
+    </w:p>
+    <w:p>
+      <w:pPr>
+        <w:jc w:val="left"/>
+      </w:pPr>
+      <w:r>
+        <w:rPr>
+          <w:rFonts w:ascii="Arial" w:hAnsi="Arial"/>
+          <w:b w:val="0"/>
+          <w:i/>
+          <w:color w:val="505050"/>
+          <w:sz w:val="22"/>
+        </w:rPr>
+        <w:t>Bot says: "Market is slow, I'll accept slightly lower-scoring setups"</w:t>
+      </w:r>
+    </w:p>
+    <w:p/>
+    <w:p>
+      <w:pPr>
+        <w:jc w:val="left"/>
+      </w:pPr>
+      <w:r>
+        <w:rPr>
+          <w:rFonts w:ascii="Arial" w:hAnsi="Arial"/>
+          <w:b/>
+          <w:i w:val="0"/>
+          <w:sz w:val="22"/>
+        </w:rPr>
+        <w:t>Scenario 2 — Too many signals firing:</w:t>
+      </w:r>
+    </w:p>
+    <w:p>
+      <w:pPr>
+        <w:jc w:val="left"/>
+        <w:shd w:val="clear" w:color="auto" w:fill="F0F0F0"/>
+      </w:pPr>
+      <w:r>
+        <w:rPr>
+          <w:rFonts w:ascii="Courier New" w:hAnsi="Courier New"/>
+          <w:color w:val="1E1E1E"/>
+          <w:sz w:val="18"/>
+        </w:rPr>
+        <w:t>4 A+ alerts in one day → threshold rises up to 85</w:t>
+      </w:r>
+    </w:p>
+    <w:p>
+      <w:pPr>
+        <w:jc w:val="left"/>
+      </w:pPr>
+      <w:r>
+        <w:rPr>
+          <w:rFonts w:ascii="Arial" w:hAnsi="Arial"/>
+          <w:b w:val="0"/>
+          <w:i/>
+          <w:color w:val="505050"/>
+          <w:sz w:val="22"/>
+        </w:rPr>
+        <w:t>Bot says: "Market is noisy, I'll be more selective"</w:t>
+      </w:r>
+    </w:p>
+    <w:p/>
+    <w:p>
+      <w:pPr>
+        <w:pStyle w:val="Heading2"/>
+        <w:jc w:val="left"/>
+      </w:pPr>
+      <w:r>
+        <w:rPr>
+          <w:color w:val="1F3864"/>
+        </w:rPr>
+        <w:t>Simple Analogy</w:t>
+      </w:r>
+    </w:p>
+    <w:p>
+      <w:pPr>
+        <w:jc w:val="left"/>
+      </w:pPr>
+      <w:r>
+        <w:rPr>
+          <w:rFonts w:ascii="Arial" w:hAnsi="Arial"/>
+          <w:b w:val="0"/>
+          <w:i w:val="0"/>
+          <w:sz w:val="22"/>
+        </w:rPr>
+        <w:t>Think of it like a water filter. Normal days — medium opening. Water runs dry (quiet market) — open it wider. Water floods in (volatile market) — tighten it.</w:t>
+      </w:r>
+    </w:p>
+    <w:p/>
+    <w:p>
+      <w:pPr>
+        <w:jc w:val="left"/>
+      </w:pPr>
+      <w:r>
+        <w:rPr>
+          <w:rFonts w:ascii="Arial" w:hAnsi="Arial"/>
+          <w:b/>
+          <w:i w:val="0"/>
+          <w:sz w:val="22"/>
+        </w:rPr>
+        <w:t>The constant goal: at least one quality alert per day, without flooding you with noise.</w:t>
+      </w:r>
+    </w:p>
+    <w:p/>
+    <w:p>
+      <w:pPr>
+        <w:pStyle w:val="Heading2"/>
+        <w:jc w:val="left"/>
+      </w:pPr>
+      <w:r>
+        <w:rPr>
+          <w:color w:val="1F3864"/>
+        </w:rPr>
+        <w:t>Threshold Boundaries</w:t>
+      </w:r>
+    </w:p>
+    <w:tbl>
+      <w:tblPr>
+        <w:tblStyle w:val="TableGrid"/>
+        <w:tblW w:type="auto" w:w="0"/>
+        <w:tblLook w:firstColumn="1" w:firstRow="1" w:lastColumn="0" w:lastRow="0" w:noHBand="0" w:noVBand="1" w:val="04A0"/>
+      </w:tblPr>
+      <w:tblGrid>
+        <w:gridCol w:w="2928"/>
+        <w:gridCol w:w="2928"/>
+        <w:gridCol w:w="2928"/>
+      </w:tblGrid>
+      <w:tr>
+        <w:tc>
+          <w:tcPr>
+            <w:tcW w:type="dxa" w:w="2928"/>
+            <w:shd w:val="clear" w:color="auto" w:fill="1F3864"/>
+          </w:tcPr>
+          <w:p>
+            <w:pPr>
+              <w:jc w:val="center"/>
+            </w:pPr>
+            <w:r>
+              <w:rPr>
+                <w:rFonts w:ascii="Arial" w:hAnsi="Arial"/>
+                <w:b/>
+                <w:color w:val="FFFFFF"/>
+                <w:sz w:val="20"/>
+              </w:rPr>
+              <w:t>Condition</w:t>
+            </w:r>
+          </w:p>
+        </w:tc>
+        <w:tc>
+          <w:tcPr>
+            <w:tcW w:type="dxa" w:w="2928"/>
+            <w:shd w:val="clear" w:color="auto" w:fill="1F3864"/>
+          </w:tcPr>
+          <w:p>
+            <w:pPr>
+              <w:jc w:val="center"/>
+            </w:pPr>
+            <w:r>
+              <w:rPr>
+                <w:rFonts w:ascii="Arial" w:hAnsi="Arial"/>
+                <w:b/>
+                <w:color w:val="FFFFFF"/>
+                <w:sz w:val="20"/>
+              </w:rPr>
+              <w:t>Effect on Threshold</w:t>
+            </w:r>
+          </w:p>
+        </w:tc>
+        <w:tc>
+          <w:tcPr>
+            <w:tcW w:type="dxa" w:w="2928"/>
+            <w:shd w:val="clear" w:color="auto" w:fill="1F3864"/>
+          </w:tcPr>
+          <w:p>
+            <w:pPr>
+              <w:jc w:val="center"/>
+            </w:pPr>
+            <w:r>
+              <w:rPr>
+                <w:rFonts w:ascii="Arial" w:hAnsi="Arial"/>
+                <w:b/>
+                <w:color w:val="FFFFFF"/>
+                <w:sz w:val="20"/>
+              </w:rPr>
+              <w:t>Limit</w:t>
+            </w:r>
+          </w:p>
+        </w:tc>
+      </w:tr>
+      <w:tr>
+        <w:tc>
+          <w:tcPr>
+            <w:tcW w:type="dxa" w:w="2928"/>
+          </w:tcPr>
+          <w:p>
+            <w:pPr>
+              <w:jc w:val="center"/>
+            </w:pPr>
+            <w:r>
+              <w:rPr>
+                <w:rFonts w:ascii="Arial" w:hAnsi="Arial"/>
+                <w:sz w:val="20"/>
+              </w:rPr>
+              <w:t>3 consecutive silent days</w:t>
+            </w:r>
+          </w:p>
+        </w:tc>
+        <w:tc>
+          <w:tcPr>
+            <w:tcW w:type="dxa" w:w="2928"/>
+          </w:tcPr>
+          <w:p>
+            <w:pPr>
+              <w:jc w:val="center"/>
+            </w:pPr>
+            <w:r>
+              <w:rPr>
+                <w:rFonts w:ascii="Arial" w:hAnsi="Arial"/>
+                <w:sz w:val="20"/>
+              </w:rPr>
+              <w:t>−2 points per reset</w:t>
+            </w:r>
+          </w:p>
+        </w:tc>
+        <w:tc>
+          <w:tcPr>
+            <w:tcW w:type="dxa" w:w="2928"/>
+          </w:tcPr>
+          <w:p>
+            <w:pPr>
+              <w:jc w:val="center"/>
+            </w:pPr>
+            <w:r>
+              <w:rPr>
+                <w:rFonts w:ascii="Arial" w:hAnsi="Arial"/>
+                <w:sz w:val="20"/>
+              </w:rPr>
+              <w:t>Floor: 65</w:t>
+            </w:r>
+          </w:p>
+        </w:tc>
+      </w:tr>
+      <w:tr>
+        <w:tc>
+          <w:tcPr>
+            <w:tcW w:type="dxa" w:w="2928"/>
+          </w:tcPr>
+          <w:p>
+            <w:pPr>
+              <w:jc w:val="center"/>
+            </w:pPr>
+            <w:r>
+              <w:rPr>
+                <w:rFonts w:ascii="Arial" w:hAnsi="Arial"/>
+                <w:sz w:val="20"/>
+              </w:rPr>
+              <w:t>Daily A+ cap reached (4/day)</w:t>
+            </w:r>
+          </w:p>
+        </w:tc>
+        <w:tc>
+          <w:tcPr>
+            <w:tcW w:type="dxa" w:w="2928"/>
+          </w:tcPr>
+          <w:p>
+            <w:pPr>
+              <w:jc w:val="center"/>
+            </w:pPr>
+            <w:r>
+              <w:rPr>
+                <w:rFonts w:ascii="Arial" w:hAnsi="Arial"/>
+                <w:sz w:val="20"/>
+              </w:rPr>
+              <w:t>+1 point next day</w:t>
+            </w:r>
+          </w:p>
+        </w:tc>
+        <w:tc>
+          <w:tcPr>
+            <w:tcW w:type="dxa" w:w="2928"/>
+          </w:tcPr>
+          <w:p>
+            <w:pPr>
+              <w:jc w:val="center"/>
+            </w:pPr>
+            <w:r>
+              <w:rPr>
+                <w:rFonts w:ascii="Arial" w:hAnsi="Arial"/>
+                <w:sz w:val="20"/>
+              </w:rPr>
+              <w:t>Ceiling: 85</w:t>
+            </w:r>
+          </w:p>
+        </w:tc>
+      </w:tr>
+      <w:tr>
+        <w:tc>
+          <w:tcPr>
+            <w:tcW w:type="dxa" w:w="2928"/>
+          </w:tcPr>
+          <w:p>
+            <w:pPr>
+              <w:jc w:val="center"/>
+            </w:pPr>
+            <w:r>
+              <w:rPr>
+                <w:rFonts w:ascii="Arial" w:hAnsi="Arial"/>
+                <w:sz w:val="20"/>
+              </w:rPr>
+              <w:t>3 consecutive losses</w:t>
+            </w:r>
+          </w:p>
+        </w:tc>
+        <w:tc>
+          <w:tcPr>
+            <w:tcW w:type="dxa" w:w="2928"/>
+          </w:tcPr>
+          <w:p>
+            <w:pPr>
+              <w:jc w:val="center"/>
+            </w:pPr>
+            <w:r>
+              <w:rPr>
+                <w:rFonts w:ascii="Arial" w:hAnsi="Arial"/>
+                <w:sz w:val="20"/>
+              </w:rPr>
+              <w:t>+5 points</w:t>
+            </w:r>
+          </w:p>
+        </w:tc>
+        <w:tc>
+          <w:tcPr>
+            <w:tcW w:type="dxa" w:w="2928"/>
+          </w:tcPr>
+          <w:p>
+            <w:pPr>
+              <w:jc w:val="center"/>
+            </w:pPr>
+            <w:r>
+              <w:rPr>
+                <w:rFonts w:ascii="Arial" w:hAnsi="Arial"/>
+                <w:sz w:val="20"/>
+              </w:rPr>
+              <w:t>Ceiling: 85</w:t>
+            </w:r>
+          </w:p>
+        </w:tc>
+      </w:tr>
+    </w:tbl>
+    <w:p/>
+    <w:p>
+      <w:pPr>
+        <w:pStyle w:val="Heading2"/>
+        <w:jc w:val="left"/>
+      </w:pPr>
+      <w:r>
+        <w:rPr>
+          <w:color w:val="1F3864"/>
+        </w:rPr>
+        <w:t>What Changes in the Code</w:t>
+      </w:r>
+    </w:p>
+    <w:p>
+      <w:pPr>
+        <w:jc w:val="left"/>
+      </w:pPr>
+      <w:r>
+        <w:rPr>
+          <w:rFonts w:ascii="Arial" w:hAnsi="Arial"/>
+          <w:b w:val="0"/>
+          <w:i w:val="0"/>
+          <w:color w:val="505050"/>
+          <w:sz w:val="22"/>
+        </w:rPr>
+        <w:t>Instead of this (rigid):</w:t>
+      </w:r>
+    </w:p>
+    <w:p>
+      <w:pPr>
+        <w:jc w:val="left"/>
+        <w:shd w:val="clear" w:color="auto" w:fill="F0F0F0"/>
+      </w:pPr>
+      <w:r>
+        <w:rPr>
+          <w:rFonts w:ascii="Courier New" w:hAnsi="Courier New"/>
+          <w:color w:val="1E1E1E"/>
+          <w:sz w:val="18"/>
+        </w:rPr>
+        <w:t>if score &gt;= 75:</w:t>
+        <w:br/>
+        <w:t xml:space="preserve">    send_alert()</w:t>
+      </w:r>
+    </w:p>
+    <w:p/>
+    <w:p>
+      <w:pPr>
+        <w:jc w:val="left"/>
+      </w:pPr>
+      <w:r>
+        <w:rPr>
+          <w:rFonts w:ascii="Arial" w:hAnsi="Arial"/>
+          <w:b w:val="0"/>
+          <w:i w:val="0"/>
+          <w:color w:val="505050"/>
+          <w:sz w:val="22"/>
+        </w:rPr>
+        <w:t>It becomes this (adaptive):</w:t>
+      </w:r>
+    </w:p>
+    <w:p>
+      <w:pPr>
+        <w:jc w:val="left"/>
+        <w:shd w:val="clear" w:color="auto" w:fill="F0F0F0"/>
+      </w:pPr>
+      <w:r>
+        <w:rPr>
+          <w:rFonts w:ascii="Courier New" w:hAnsi="Courier New"/>
+          <w:color w:val="1E1E1E"/>
+          <w:sz w:val="18"/>
+        </w:rPr>
+        <w:t>threshold = get_adaptive_threshold()  # calculates current threshold</w:t>
+        <w:br/>
+        <w:t>if score &gt;= threshold:</w:t>
+        <w:br/>
+        <w:t xml:space="preserve">    send_alert()</w:t>
+      </w:r>
+    </w:p>
     <w:sectPr>
       <w:pgSz w:w="12240" w:h="15840"/>
       <w:pgMar w:top="1440" w:right="1728" w:bottom="1440" w:left="1728" w:header="720" w:footer="720" w:gutter="0"/>

</xml_diff>